<commit_message>
Add skipped-tasks bar chart (Fig. 9) to paper and task-04 report
</commit_message>
<xml_diff>
--- a/revisions/MILP_skipped_tasks.docx
+++ b/revisions/MILP_skipped_tasks.docx
@@ -3430,7 +3430,43 @@
     </w:tbl>
     <w:p>
       <w:r>
-        <w:t>Every run - solved or skipped over the cap - is in revisions/results/task-04/skipped_tasks.csv, produced by revisions/check_skipped_tasks.py.</w:t>
+        <w:t>Every run - solved or skipped over the cap - is in revisions/results/task-04/skipped_tasks.csv, produced by revisions/check_skipped_tasks.py. The same data is drawn as a figure in the paper (revisions/results/task-04/skipped_tasks.png, made by make_task4_figure.py):</w:t>
+      </w:r>
+    </w:p>
+    <w:p>
+      <w:r>
+        <w:drawing>
+          <wp:inline xmlns:a="http://schemas.openxmlformats.org/drawingml/2006/main" xmlns:pic="http://schemas.openxmlformats.org/drawingml/2006/picture">
+            <wp:extent cx="3200400" cy="2465832"/>
+            <wp:docPr id="1" name="Picture 1"/>
+            <wp:cNvGraphicFramePr>
+              <a:graphicFrameLocks noChangeAspect="1"/>
+            </wp:cNvGraphicFramePr>
+            <a:graphic>
+              <a:graphicData uri="http://schemas.openxmlformats.org/drawingml/2006/picture">
+                <pic:pic>
+                  <pic:nvPicPr>
+                    <pic:cNvPr id="0" name="skipped_tasks.png"/>
+                    <pic:cNvPicPr/>
+                  </pic:nvPicPr>
+                  <pic:blipFill>
+                    <a:blip r:embed="rId9"/>
+                    <a:stretch>
+                      <a:fillRect/>
+                    </a:stretch>
+                  </pic:blipFill>
+                  <pic:spPr>
+                    <a:xfrm>
+                      <a:off x="0" y="0"/>
+                      <a:ext cx="3200400" cy="2465832"/>
+                    </a:xfrm>
+                    <a:prstGeom prst="rect"/>
+                  </pic:spPr>
+                </pic:pic>
+              </a:graphicData>
+            </a:graphic>
+          </wp:inline>
+        </w:drawing>
       </w:r>
     </w:p>
     <w:sectPr>

</xml_diff>